<commit_message>
cv: detail product launches and selected project contributions
</commit_message>
<xml_diff>
--- a/cv/professional-cv.docx
+++ b/cv/professional-cv.docx
@@ -135,13 +135,23 @@
     </w:p>
     <w:p>
       <w:pPr>
-        <w:pStyle w:val="ListBullet"/>
+        <w:keepNext/>
       </w:pPr>
       <w:r>
         <w:rPr>
           <w:b w:val="0"/>
         </w:rPr>
-        <w:t>Served as Acting Director of Data for a virtual banking initiative, leading platform setup from inception across data engineering, data architecture, and data governance.</w:t>
+      </w:r>
+      <w:r>
+        <w:rPr>
+          <w:b/>
+        </w:rPr>
+        <w:t>Virtual Banking Data Foundations and Data and AI Platform Development</w:t>
+      </w:r>
+      <w:r>
+        <w:rPr>
+          <w:b w:val="0"/>
+        </w:rPr>
       </w:r>
     </w:p>
     <w:p>
@@ -152,7 +162,29 @@
         <w:rPr>
           <w:b w:val="0"/>
         </w:rPr>
-        <w:t>Led development of a Data and AI Platform for a new group company.</w:t>
+        <w:t>Served as Acting Director of Data for a virtual banking initiative, leading data platform setup from inception.</w:t>
+      </w:r>
+    </w:p>
+    <w:p>
+      <w:pPr>
+        <w:pStyle w:val="ListBullet"/>
+      </w:pPr>
+      <w:r>
+        <w:rPr>
+          <w:b w:val="0"/>
+        </w:rPr>
+        <w:t>Led the setup of data engineering, data architecture, and data governance capabilities within the initiative's data remit.</w:t>
+      </w:r>
+    </w:p>
+    <w:p>
+      <w:pPr>
+        <w:pStyle w:val="ListBullet"/>
+      </w:pPr>
+      <w:r>
+        <w:rPr>
+          <w:b w:val="0"/>
+        </w:rPr>
+        <w:t>Directed Data and AI Platform development for a new group company, with scope spanning the platform and the supporting data capabilities.</w:t>
       </w:r>
     </w:p>
     <w:p>
@@ -197,6 +229,27 @@
     </w:p>
     <w:p>
       <w:pPr>
+        <w:keepNext/>
+      </w:pPr>
+      <w:r>
+        <w:rPr>
+          <w:b w:val="0"/>
+        </w:rPr>
+      </w:r>
+      <w:r>
+        <w:rPr>
+          <w:b/>
+        </w:rPr>
+        <w:t>Analytics Organization and Product Team Establishment</w:t>
+      </w:r>
+      <w:r>
+        <w:rPr>
+          <w:b w:val="0"/>
+        </w:rPr>
+      </w:r>
+    </w:p>
+    <w:p>
+      <w:pPr>
         <w:pStyle w:val="ListBullet"/>
       </w:pPr>
       <w:r>
@@ -214,7 +267,28 @@
         <w:rPr>
           <w:b w:val="0"/>
         </w:rPr>
-        <w:t>Led cross-functional teams of AI scientists, data scientists, data analysts, BI engineers, machine learning engineers, and product owners.</w:t>
+        <w:t>Brought together AI scientists, data scientists, data analysts, BI engineers, machine learning engineers, and product owners within the department, spanning research, analytics, engineering, and product responsibilities.</w:t>
+      </w:r>
+    </w:p>
+    <w:p>
+      <w:pPr>
+        <w:keepNext/>
+      </w:pPr>
+      <w:r>
+        <w:rPr>
+          <w:b w:val="0"/>
+        </w:rPr>
+      </w:r>
+      <w:r>
+        <w:rPr>
+          <w:b/>
+        </w:rPr>
+        <w:t>AI and Analytics Product Development</w:t>
+      </w:r>
+      <w:r>
+        <w:rPr>
+          <w:b w:val="0"/>
+        </w:rPr>
       </w:r>
     </w:p>
     <w:p>
@@ -225,7 +299,7 @@
         <w:rPr>
           <w:b w:val="0"/>
         </w:rPr>
-        <w:t>Directed the product development lifecycle from vision and roadmap through research, proof of concept, and delivery.</w:t>
+        <w:t>Directed product vision and roadmaps, with leadership responsibility extending through research, proofs of concept, and product delivery.</w:t>
       </w:r>
     </w:p>
     <w:p>
@@ -370,7 +444,7 @@
         <w:rPr>
           <w:b w:val="0"/>
         </w:rPr>
-        <w:t>Led 30+ data scientists in research and development of analytics products within an in-house startup.</w:t>
+        <w:t>Led 30+ data scientists researching and developing analytics products within an in-house startup.</w:t>
       </w:r>
     </w:p>
     <w:p>
@@ -453,7 +527,16 @@
         <w:pStyle w:val="Heading1"/>
       </w:pPr>
       <w:r>
-        <w:t>Selected Product Portfolio</w:t>
+        <w:t>Selected Products Built and Launched</w:t>
+      </w:r>
+    </w:p>
+    <w:p>
+      <w:pPr/>
+      <w:r>
+        <w:rPr>
+          <w:b w:val="0"/>
+        </w:rPr>
+        <w:t>Led development and launch of the following products during the True Digital Group tenure. Leadership covered product vision and roadmaps, research and proofs of concept, product development, and delivery, working with product owners, UX/UI, and the Analytics Platform team.</w:t>
       </w:r>
     </w:p>
     <w:p>
@@ -469,13 +552,13 @@
         <w:rPr>
           <w:b/>
         </w:rPr>
-        <w:t>Location intelligence:</w:t>
+        <w:t>GeoPulse | Location Intelligence:</w:t>
       </w:r>
       <w:r>
         <w:rPr>
           <w:b w:val="0"/>
         </w:rPr>
-        <w:t xml:space="preserve"> Multidimensional density heat maps with analytical insights.</w:t>
+        <w:t xml:space="preserve"> Delivered multidimensional density heat maps with analytical insights, translating location data into a visual analytics product.</w:t>
       </w:r>
     </w:p>
     <w:p>
@@ -491,13 +574,13 @@
         <w:rPr>
           <w:b/>
         </w:rPr>
-        <w:t>Competitive analytics:</w:t>
+        <w:t>DigiPulse | Competitive Digital Analytics:</w:t>
       </w:r>
       <w:r>
         <w:rPr>
           <w:b w:val="0"/>
         </w:rPr>
-        <w:t xml:space="preserve"> Reports analyzing digital footprints across competing businesses.</w:t>
+        <w:t xml:space="preserve"> Delivered digital footprint reports comparing competing businesses, providing a product for examining their digital activity.</w:t>
       </w:r>
     </w:p>
     <w:p>
@@ -513,13 +596,13 @@
         <w:rPr>
           <w:b/>
         </w:rPr>
-        <w:t>Behavioral analytics:</w:t>
+        <w:t>Customer360 for True Group | Behavioral Analytics:</w:t>
       </w:r>
       <w:r>
         <w:rPr>
           <w:b w:val="0"/>
         </w:rPr>
-        <w:t xml:space="preserve"> Automated behavior extraction engines operating over a big-data platform.</w:t>
+        <w:t xml:space="preserve"> Developed and launched automated behavior extraction engines over a big-data platform for True Group.</w:t>
       </w:r>
     </w:p>
     <w:p>
@@ -535,13 +618,13 @@
         <w:rPr>
           <w:b/>
         </w:rPr>
-        <w:t>Credit analytics:</w:t>
+        <w:t>True Score | Alternative Credit Scoring:</w:t>
       </w:r>
       <w:r>
         <w:rPr>
           <w:b w:val="0"/>
         </w:rPr>
-        <w:t xml:space="preserve"> Alternative credit scoring as a service and hybrid credit capabilities across group businesses.</w:t>
+        <w:t xml:space="preserve"> Developed and launched alternative credit scoring as a service, extending the portfolio into credit analytics.</w:t>
       </w:r>
     </w:p>
     <w:p>
@@ -923,13 +1006,89 @@
     </w:p>
     <w:p>
       <w:pPr>
+        <w:keepNext/>
+      </w:pPr>
+      <w:r>
+        <w:rPr>
+          <w:b w:val="0"/>
+        </w:rPr>
+      </w:r>
+      <w:r>
+        <w:rPr>
+          <w:b/>
+        </w:rPr>
+        <w:t>Selected Applied Research Projects | May 2013 - April 2018</w:t>
+      </w:r>
+      <w:r>
+        <w:rPr>
+          <w:b w:val="0"/>
+        </w:rPr>
+      </w:r>
+    </w:p>
+    <w:p>
+      <w:pPr>
         <w:pStyle w:val="ListBullet"/>
       </w:pPr>
       <w:r>
         <w:rPr>
           <w:b w:val="0"/>
         </w:rPr>
-        <w:t>Conducted applied research in open IoT platforms, access-control prototypes, sensor analytics, and Thai-language social media analysis using Google Cloud Platform.</w:t>
+      </w:r>
+      <w:r>
+        <w:rPr>
+          <w:b/>
+        </w:rPr>
+        <w:t>Open IoT platform and prototypes:</w:t>
+      </w:r>
+      <w:r>
+        <w:rPr>
+          <w:b w:val="0"/>
+        </w:rPr>
+        <w:t xml:space="preserve"> Developed an open platform using Raspberry Pi and prototypes for access control, voice-controlled communications, and customer counting.</w:t>
+      </w:r>
+    </w:p>
+    <w:p>
+      <w:pPr>
+        <w:pStyle w:val="ListBullet"/>
+      </w:pPr>
+      <w:r>
+        <w:rPr>
+          <w:b w:val="0"/>
+        </w:rPr>
+      </w:r>
+      <w:r>
+        <w:rPr>
+          <w:b/>
+        </w:rPr>
+        <w:t>Sensor analytics:</w:t>
+      </w:r>
+      <w:r>
+        <w:rPr>
+          <w:b w:val="0"/>
+        </w:rPr>
+        <w:t xml:space="preserve"> Conducted big-data analysis using temperature and power sensor data.</w:t>
+      </w:r>
+    </w:p>
+    <w:p>
+      <w:pPr>
+        <w:pStyle w:val="ListBullet"/>
+      </w:pPr>
+      <w:r>
+        <w:rPr>
+          <w:b w:val="0"/>
+        </w:rPr>
+      </w:r>
+      <w:r>
+        <w:rPr>
+          <w:b/>
+        </w:rPr>
+        <w:t>Cloud-based social media analytics:</w:t>
+      </w:r>
+      <w:r>
+        <w:rPr>
+          <w:b w:val="0"/>
+        </w:rPr>
+        <w:t xml:space="preserve"> Conducted Thai-language social trend analysis using Google Cloud Platform.</w:t>
       </w:r>
     </w:p>
     <w:p>

</xml_diff>

<commit_message>
cv: record successful data and AI platform launch with lean team
</commit_message>
<xml_diff>
--- a/cv/professional-cv.docx
+++ b/cv/professional-cv.docx
@@ -146,12 +146,23 @@
         <w:rPr>
           <w:b/>
         </w:rPr>
-        <w:t>Virtual Banking Data Foundations and Data and AI Platform Development</w:t>
+        <w:t>Data and AI Platform Launch and Virtual Banking Data Foundations</w:t>
       </w:r>
       <w:r>
         <w:rPr>
           <w:b w:val="0"/>
         </w:rPr>
+      </w:r>
+    </w:p>
+    <w:p>
+      <w:pPr>
+        <w:pStyle w:val="ListBullet"/>
+      </w:pPr>
+      <w:r>
+        <w:rPr>
+          <w:b w:val="0"/>
+        </w:rPr>
+        <w:t>Successfully launched a Data and AI Platform for a new group company with a lean team.</w:t>
       </w:r>
     </w:p>
     <w:p>
@@ -174,17 +185,6 @@
           <w:b w:val="0"/>
         </w:rPr>
         <w:t>Led the setup of data engineering, data architecture, and data governance capabilities within the initiative's data remit.</w:t>
-      </w:r>
-    </w:p>
-    <w:p>
-      <w:pPr>
-        <w:pStyle w:val="ListBullet"/>
-      </w:pPr>
-      <w:r>
-        <w:rPr>
-          <w:b w:val="0"/>
-        </w:rPr>
-        <w:t>Directed Data and AI Platform development for a new group company, with scope spanning the platform and the supporting data capabilities.</w:t>
       </w:r>
     </w:p>
     <w:p>

</xml_diff>

<commit_message>
profile: add Saijo Denki consumer IoT product launches
</commit_message>
<xml_diff>
--- a/cv/professional-cv.docx
+++ b/cv/professional-cv.docx
@@ -1128,7 +1128,18 @@
         <w:rPr>
           <w:b w:val="0"/>
         </w:rPr>
-        <w:t>Conducted product and service research within an in-house startup unit, covering online-to-offline services, connected devices, and mobile network applications.</w:t>
+        <w:t>Launched IoT-enabled consumer products, including split-system air conditioners and air purifiers.</w:t>
+      </w:r>
+    </w:p>
+    <w:p>
+      <w:pPr>
+        <w:pStyle w:val="ListBullet"/>
+      </w:pPr>
+      <w:r>
+        <w:rPr>
+          <w:b w:val="0"/>
+        </w:rPr>
+        <w:t>Researched IoT, mobile network applications, and online-to-offline services in an in-house startup.</w:t>
       </w:r>
     </w:p>
     <w:p>

</xml_diff>

<commit_message>
cv: streamline structure while preserving career content
</commit_message>
<xml_diff>
--- a/cv/professional-cv.docx
+++ b/cv/professional-cv.docx
@@ -23,21 +23,12 @@
         <w:rPr>
           <w:b/>
         </w:rPr>
-        <w:t>PROFESSIONAL CURRICULUM VITAE</w:t>
+        <w:t>EXECUTIVE DATA AND AI LEADER</w:t>
       </w:r>
       <w:r>
         <w:rPr>
           <w:b w:val="0"/>
         </w:rPr>
-      </w:r>
-    </w:p>
-    <w:p>
-      <w:pPr/>
-      <w:r>
-        <w:rPr>
-          <w:b w:val="0"/>
-        </w:rPr>
-        <w:t>Executive Data and AI Leadership | Analytics Products | University Teaching</w:t>
       </w:r>
     </w:p>
     <w:p>
@@ -72,1366 +63,7 @@
         <w:rPr>
           <w:b w:val="0"/>
         </w:rPr>
-        <w:t>Data and AI executive with experience building analytics organizations, leading multidisciplinary teams, and establishing data foundations across financial services and telecommunications. Served as Acting Director of Data for a virtual banking initiative at Infinitas by Krungthai, leading platform setup across data engineering, architecture, and governance. A founding member of DataX, built the analytics and products department and directed AI product development. Previously led 30+ data scientists at True Digital Group. Combines organization-building experience and technical depth with university teaching in data science and business analytics, and research on decentralized data strategies for virtual banking.</w:t>
-      </w:r>
-    </w:p>
-    <w:p>
-      <w:pPr>
-        <w:pStyle w:val="Heading1"/>
-      </w:pPr>
-      <w:r>
-        <w:t>Professional Experience</w:t>
-      </w:r>
-    </w:p>
-    <w:p>
-      <w:pPr>
-        <w:keepNext/>
-      </w:pPr>
-      <w:r>
-        <w:rPr>
-          <w:b w:val="0"/>
-        </w:rPr>
-      </w:r>
-      <w:r>
-        <w:rPr>
-          <w:b/>
-        </w:rPr>
-        <w:t>Career Break from Corporate Roles | August 2026 - Present</w:t>
-      </w:r>
-      <w:r>
-        <w:rPr>
-          <w:b w:val="0"/>
-        </w:rPr>
-      </w:r>
-    </w:p>
-    <w:p>
-      <w:pPr>
-        <w:pStyle w:val="Heading2"/>
-      </w:pPr>
-      <w:r>
-        <w:t>Infinitas by Krungthai</w:t>
-      </w:r>
-    </w:p>
-    <w:p>
-      <w:pPr>
-        <w:keepNext/>
-      </w:pPr>
-      <w:r>
-        <w:rPr>
-          <w:b w:val="0"/>
-        </w:rPr>
-      </w:r>
-      <w:r>
-        <w:rPr>
-          <w:b/>
-        </w:rPr>
-        <w:t>Director of Data Innovation | December 2024 - July 2026 | Bangkok, Thailand</w:t>
-      </w:r>
-      <w:r>
-        <w:rPr>
-          <w:b w:val="0"/>
-        </w:rPr>
-      </w:r>
-    </w:p>
-    <w:p>
-      <w:pPr>
-        <w:keepNext/>
-      </w:pPr>
-      <w:r>
-        <w:rPr>
-          <w:b w:val="0"/>
-        </w:rPr>
-      </w:r>
-      <w:r>
-        <w:rPr>
-          <w:b/>
-        </w:rPr>
-        <w:t>Data and AI Platform Launch and Virtual Banking Data Foundations</w:t>
-      </w:r>
-      <w:r>
-        <w:rPr>
-          <w:b w:val="0"/>
-        </w:rPr>
-      </w:r>
-    </w:p>
-    <w:p>
-      <w:pPr>
-        <w:pStyle w:val="ListBullet"/>
-      </w:pPr>
-      <w:r>
-        <w:rPr>
-          <w:b w:val="0"/>
-        </w:rPr>
-        <w:t>Successfully launched a Data and AI Platform for a new group company with a lean team.</w:t>
-      </w:r>
-    </w:p>
-    <w:p>
-      <w:pPr>
-        <w:pStyle w:val="ListBullet"/>
-      </w:pPr>
-      <w:r>
-        <w:rPr>
-          <w:b w:val="0"/>
-        </w:rPr>
-        <w:t>Served as Acting Director of Data for a virtual banking initiative, leading data platform setup from inception.</w:t>
-      </w:r>
-    </w:p>
-    <w:p>
-      <w:pPr>
-        <w:pStyle w:val="ListBullet"/>
-      </w:pPr>
-      <w:r>
-        <w:rPr>
-          <w:b w:val="0"/>
-        </w:rPr>
-        <w:t>Led the setup of data engineering, data architecture, and data governance capabilities within the initiative's data remit.</w:t>
-      </w:r>
-    </w:p>
-    <w:p>
-      <w:pPr>
-        <w:pStyle w:val="ListBullet"/>
-      </w:pPr>
-      <w:r>
-        <w:rPr>
-          <w:b w:val="0"/>
-        </w:rPr>
-        <w:t>Planned the transfer of data and AI platform practices to other group companies.</w:t>
-      </w:r>
-    </w:p>
-    <w:p>
-      <w:pPr>
-        <w:pStyle w:val="Heading2"/>
-      </w:pPr>
-      <w:r>
-        <w:t>SCB DataX</w:t>
-      </w:r>
-    </w:p>
-    <w:p>
-      <w:pPr>
-        <w:keepNext/>
-      </w:pPr>
-      <w:r>
-        <w:rPr>
-          <w:b w:val="0"/>
-        </w:rPr>
-      </w:r>
-      <w:r>
-        <w:rPr>
-          <w:b/>
-        </w:rPr>
-        <w:t>Head of Analytics and Products | November 2021 - November 2024 | Bangkok, Thailand</w:t>
-      </w:r>
-      <w:r>
-        <w:rPr>
-          <w:b w:val="0"/>
-        </w:rPr>
-      </w:r>
-    </w:p>
-    <w:p>
-      <w:pPr>
-        <w:keepNext/>
-      </w:pPr>
-      <w:r>
-        <w:rPr>
-          <w:b w:val="0"/>
-        </w:rPr>
-      </w:r>
-      <w:r>
-        <w:rPr>
-          <w:b/>
-        </w:rPr>
-        <w:t>Analytics Organization and Product Team Establishment</w:t>
-      </w:r>
-      <w:r>
-        <w:rPr>
-          <w:b w:val="0"/>
-        </w:rPr>
-      </w:r>
-    </w:p>
-    <w:p>
-      <w:pPr>
-        <w:pStyle w:val="ListBullet"/>
-      </w:pPr>
-      <w:r>
-        <w:rPr>
-          <w:b w:val="0"/>
-        </w:rPr>
-        <w:t>As a founding member of DataX, the analytics subsidiary of SCB X, built the analytics organization and product team from inception.</w:t>
-      </w:r>
-    </w:p>
-    <w:p>
-      <w:pPr>
-        <w:pStyle w:val="ListBullet"/>
-      </w:pPr>
-      <w:r>
-        <w:rPr>
-          <w:b w:val="0"/>
-        </w:rPr>
-        <w:t>Brought together AI scientists, data scientists, data analysts, BI engineers, machine learning engineers, and product owners within the department, spanning research, analytics, engineering, and product responsibilities.</w:t>
-      </w:r>
-    </w:p>
-    <w:p>
-      <w:pPr>
-        <w:keepNext/>
-      </w:pPr>
-      <w:r>
-        <w:rPr>
-          <w:b w:val="0"/>
-        </w:rPr>
-      </w:r>
-      <w:r>
-        <w:rPr>
-          <w:b/>
-        </w:rPr>
-        <w:t>AI and Analytics Product Development</w:t>
-      </w:r>
-      <w:r>
-        <w:rPr>
-          <w:b w:val="0"/>
-        </w:rPr>
-      </w:r>
-    </w:p>
-    <w:p>
-      <w:pPr>
-        <w:pStyle w:val="ListBullet"/>
-      </w:pPr>
-      <w:r>
-        <w:rPr>
-          <w:b w:val="0"/>
-        </w:rPr>
-        <w:t>Directed product vision and roadmaps, with leadership responsibility extending through research, proofs of concept, and product delivery.</w:t>
-      </w:r>
-    </w:p>
-    <w:p>
-      <w:pPr>
-        <w:pStyle w:val="Heading1"/>
-        <w:pageBreakBefore/>
-      </w:pPr>
-      <w:r>
-        <w:t>Analytics Product Leadership</w:t>
-      </w:r>
-    </w:p>
-    <w:p>
-      <w:pPr>
-        <w:pStyle w:val="Heading2"/>
-      </w:pPr>
-      <w:r>
-        <w:t>True Digital Group</w:t>
-      </w:r>
-    </w:p>
-    <w:p>
-      <w:pPr>
-        <w:keepNext/>
-      </w:pPr>
-      <w:r>
-        <w:rPr>
-          <w:b w:val="0"/>
-        </w:rPr>
-      </w:r>
-      <w:r>
-        <w:rPr>
-          <w:b/>
-        </w:rPr>
-        <w:t>Analytics Business | March 2018 - October 2021 | Bangkok, Thailand</w:t>
-      </w:r>
-      <w:r>
-        <w:rPr>
-          <w:b w:val="0"/>
-        </w:rPr>
-      </w:r>
-    </w:p>
-    <w:p>
-      <w:pPr>
-        <w:keepNext/>
-      </w:pPr>
-      <w:r>
-        <w:rPr>
-          <w:b w:val="0"/>
-        </w:rPr>
-      </w:r>
-      <w:r>
-        <w:rPr>
-          <w:b/>
-        </w:rPr>
-        <w:t>Head of Product, Analytics Product | May 2021 - October 2021</w:t>
-      </w:r>
-      <w:r>
-        <w:rPr>
-          <w:b w:val="0"/>
-        </w:rPr>
-      </w:r>
-    </w:p>
-    <w:p>
-      <w:pPr>
-        <w:pStyle w:val="ListBullet"/>
-      </w:pPr>
-      <w:r>
-        <w:rPr>
-          <w:b w:val="0"/>
-        </w:rPr>
-        <w:t>Led product development, product owners, and UX/UI teams across the analytics product portfolio.</w:t>
-      </w:r>
-    </w:p>
-    <w:p>
-      <w:pPr>
-        <w:pStyle w:val="ListBullet"/>
-      </w:pPr>
-      <w:r>
-        <w:rPr>
-          <w:b w:val="0"/>
-        </w:rPr>
-        <w:t>Directed product vision and roadmaps, research, proofs of concept, and delivery.</w:t>
-      </w:r>
-    </w:p>
-    <w:p>
-      <w:pPr>
-        <w:pStyle w:val="ListBullet"/>
-      </w:pPr>
-      <w:r>
-        <w:rPr>
-          <w:b w:val="0"/>
-        </w:rPr>
-        <w:t>Partnered with the Analytics Platform team on software development to bring analytics products to market.</w:t>
-      </w:r>
-    </w:p>
-    <w:p>
-      <w:pPr>
-        <w:keepNext/>
-      </w:pPr>
-      <w:r>
-        <w:rPr>
-          <w:b w:val="0"/>
-        </w:rPr>
-      </w:r>
-      <w:r>
-        <w:rPr>
-          <w:b/>
-        </w:rPr>
-        <w:t>Head of Product Development, Analytics Product | June 2019 - April 2021</w:t>
-      </w:r>
-      <w:r>
-        <w:rPr>
-          <w:b w:val="0"/>
-        </w:rPr>
-      </w:r>
-    </w:p>
-    <w:p>
-      <w:pPr>
-        <w:keepNext/>
-      </w:pPr>
-      <w:r>
-        <w:rPr>
-          <w:b w:val="0"/>
-        </w:rPr>
-      </w:r>
-      <w:r>
-        <w:rPr>
-          <w:b/>
-        </w:rPr>
-        <w:t>Acting Head of Product | October 2020 - April 2021</w:t>
-      </w:r>
-      <w:r>
-        <w:rPr>
-          <w:b w:val="0"/>
-        </w:rPr>
-      </w:r>
-    </w:p>
-    <w:p>
-      <w:pPr>
-        <w:pStyle w:val="ListBullet"/>
-      </w:pPr>
-      <w:r>
-        <w:rPr>
-          <w:b w:val="0"/>
-        </w:rPr>
-        <w:t>Led 30+ data scientists researching and developing analytics products within an in-house startup.</w:t>
-      </w:r>
-    </w:p>
-    <w:p>
-      <w:pPr>
-        <w:keepNext/>
-      </w:pPr>
-      <w:r>
-        <w:rPr>
-          <w:b w:val="0"/>
-        </w:rPr>
-      </w:r>
-      <w:r>
-        <w:rPr>
-          <w:b/>
-        </w:rPr>
-        <w:t>Head of Risk Management Product, Analytics Product | January 2019 - May 2019</w:t>
-      </w:r>
-      <w:r>
-        <w:rPr>
-          <w:b w:val="0"/>
-        </w:rPr>
-      </w:r>
-    </w:p>
-    <w:p>
-      <w:pPr>
-        <w:pStyle w:val="ListBullet"/>
-      </w:pPr>
-      <w:r>
-        <w:rPr>
-          <w:b w:val="0"/>
-        </w:rPr>
-        <w:t>Led risk analytics product development and technical operations for internal and external clients.</w:t>
-      </w:r>
-    </w:p>
-    <w:p>
-      <w:pPr>
-        <w:pStyle w:val="ListBullet"/>
-      </w:pPr>
-      <w:r>
-        <w:rPr>
-          <w:b w:val="0"/>
-        </w:rPr>
-        <w:t>Managed a multidisciplinary team of data scientists, business analysts, developers, and financial experts.</w:t>
-      </w:r>
-    </w:p>
-    <w:p>
-      <w:pPr>
-        <w:pStyle w:val="ListBullet"/>
-      </w:pPr>
-      <w:r>
-        <w:rPr>
-          <w:b w:val="0"/>
-        </w:rPr>
-        <w:t>Provided hybrid credit capabilities and solutions across multiple CP Group businesses.</w:t>
-      </w:r>
-    </w:p>
-    <w:p>
-      <w:pPr>
-        <w:keepNext/>
-      </w:pPr>
-      <w:r>
-        <w:rPr>
-          <w:b w:val="0"/>
-        </w:rPr>
-      </w:r>
-      <w:r>
-        <w:rPr>
-          <w:b/>
-        </w:rPr>
-        <w:t>Principal Data Scientist | March 2018 - October 2021</w:t>
-      </w:r>
-      <w:r>
-        <w:rPr>
-          <w:b w:val="0"/>
-        </w:rPr>
-      </w:r>
-    </w:p>
-    <w:p>
-      <w:pPr>
-        <w:pStyle w:val="Heading1"/>
-      </w:pPr>
-      <w:r>
-        <w:t>Selected Products Built and Launched</w:t>
-      </w:r>
-    </w:p>
-    <w:p>
-      <w:pPr/>
-      <w:r>
-        <w:rPr>
-          <w:b w:val="0"/>
-        </w:rPr>
-        <w:t>Led development and launch of the following products during the True Digital Group tenure. Leadership covered product vision and roadmaps, research and proofs of concept, product development, and delivery, working with product owners, UX/UI, and the Analytics Platform team.</w:t>
-      </w:r>
-    </w:p>
-    <w:p>
-      <w:pPr>
-        <w:pStyle w:val="ListBullet"/>
-      </w:pPr>
-      <w:r>
-        <w:rPr>
-          <w:b w:val="0"/>
-        </w:rPr>
-      </w:r>
-      <w:r>
-        <w:rPr>
-          <w:b/>
-        </w:rPr>
-        <w:t>GeoPulse | Location Intelligence:</w:t>
-      </w:r>
-      <w:r>
-        <w:rPr>
-          <w:b w:val="0"/>
-        </w:rPr>
-        <w:t xml:space="preserve"> Delivered multidimensional density heat maps with analytical insights, translating location data into a visual analytics product.</w:t>
-      </w:r>
-    </w:p>
-    <w:p>
-      <w:pPr>
-        <w:pStyle w:val="ListBullet"/>
-      </w:pPr>
-      <w:r>
-        <w:rPr>
-          <w:b w:val="0"/>
-        </w:rPr>
-      </w:r>
-      <w:r>
-        <w:rPr>
-          <w:b/>
-        </w:rPr>
-        <w:t>DigiPulse | Competitive Digital Analytics:</w:t>
-      </w:r>
-      <w:r>
-        <w:rPr>
-          <w:b w:val="0"/>
-        </w:rPr>
-        <w:t xml:space="preserve"> Delivered digital footprint reports comparing competing businesses, providing a product for examining their digital activity.</w:t>
-      </w:r>
-    </w:p>
-    <w:p>
-      <w:pPr>
-        <w:pStyle w:val="ListBullet"/>
-      </w:pPr>
-      <w:r>
-        <w:rPr>
-          <w:b w:val="0"/>
-        </w:rPr>
-      </w:r>
-      <w:r>
-        <w:rPr>
-          <w:b/>
-        </w:rPr>
-        <w:t>Customer360 for True Group | Behavioral Analytics:</w:t>
-      </w:r>
-      <w:r>
-        <w:rPr>
-          <w:b w:val="0"/>
-        </w:rPr>
-        <w:t xml:space="preserve"> Developed and launched automated behavior extraction engines over a big-data platform for True Group.</w:t>
-      </w:r>
-    </w:p>
-    <w:p>
-      <w:pPr>
-        <w:pStyle w:val="ListBullet"/>
-      </w:pPr>
-      <w:r>
-        <w:rPr>
-          <w:b w:val="0"/>
-        </w:rPr>
-      </w:r>
-      <w:r>
-        <w:rPr>
-          <w:b/>
-        </w:rPr>
-        <w:t>True Score | Alternative Credit Scoring:</w:t>
-      </w:r>
-      <w:r>
-        <w:rPr>
-          <w:b w:val="0"/>
-        </w:rPr>
-        <w:t xml:space="preserve"> Developed and launched alternative credit scoring as a service, extending the portfolio into credit analytics.</w:t>
-      </w:r>
-    </w:p>
-    <w:p>
-      <w:pPr>
-        <w:pStyle w:val="Heading1"/>
-        <w:pageBreakBefore/>
-      </w:pPr>
-      <w:r>
-        <w:t>Adjunct Teaching and Professional Contribution</w:t>
-      </w:r>
-    </w:p>
-    <w:p>
-      <w:pPr>
-        <w:pStyle w:val="Heading2"/>
-      </w:pPr>
-      <w:r>
-        <w:t>Mahidol University</w:t>
-      </w:r>
-    </w:p>
-    <w:p>
-      <w:pPr>
-        <w:keepNext/>
-      </w:pPr>
-      <w:r>
-        <w:rPr>
-          <w:b w:val="0"/>
-        </w:rPr>
-      </w:r>
-      <w:r>
-        <w:rPr>
-          <w:b/>
-        </w:rPr>
-        <w:t>Adjunct Faculty Member | September 2026 - Present</w:t>
-      </w:r>
-      <w:r>
-        <w:rPr>
-          <w:b w:val="0"/>
-        </w:rPr>
-      </w:r>
-    </w:p>
-    <w:p>
-      <w:pPr/>
-      <w:r>
-        <w:rPr>
-          <w:b w:val="0"/>
-        </w:rPr>
-        <w:t>ICT program.</w:t>
-      </w:r>
-    </w:p>
-    <w:p>
-      <w:pPr>
-        <w:pStyle w:val="Heading2"/>
-      </w:pPr>
-      <w:r>
-        <w:t>Panyapiwat Institute of Management</w:t>
-      </w:r>
-    </w:p>
-    <w:p>
-      <w:pPr>
-        <w:keepNext/>
-      </w:pPr>
-      <w:r>
-        <w:rPr>
-          <w:b w:val="0"/>
-        </w:rPr>
-      </w:r>
-      <w:r>
-        <w:rPr>
-          <w:b/>
-        </w:rPr>
-        <w:t>Adjunct Faculty Member | 2021 - Present</w:t>
-      </w:r>
-      <w:r>
-        <w:rPr>
-          <w:b w:val="0"/>
-        </w:rPr>
-      </w:r>
-    </w:p>
-    <w:p>
-      <w:pPr>
-        <w:pStyle w:val="ListBullet"/>
-      </w:pPr>
-      <w:r>
-        <w:rPr>
-          <w:b w:val="0"/>
-        </w:rPr>
-        <w:t>Teach IB5172704, Data Analytics and Governance for Business Decision; previously IB62709, Big Data Analytics for Business Decision.</w:t>
-      </w:r>
-    </w:p>
-    <w:p>
-      <w:pPr>
-        <w:pStyle w:val="ListBullet"/>
-      </w:pPr>
-      <w:r>
-        <w:rPr>
-          <w:b w:val="0"/>
-        </w:rPr>
-        <w:t>Taught MI 62212, Big Data Analytics for Consumer Behavior, semester 1/2021.</w:t>
-      </w:r>
-    </w:p>
-    <w:p>
-      <w:pPr>
-        <w:pStyle w:val="ListBullet"/>
-      </w:pPr>
-      <w:r>
-        <w:rPr>
-          <w:b w:val="0"/>
-        </w:rPr>
-        <w:t>Served as Responsible Faculty Member, 2019-2020.</w:t>
-      </w:r>
-    </w:p>
-    <w:p>
-      <w:pPr>
-        <w:pStyle w:val="Heading2"/>
-      </w:pPr>
-      <w:r>
-        <w:t>King Mongkut's University of Technology North Bangkok</w:t>
-      </w:r>
-    </w:p>
-    <w:p>
-      <w:pPr>
-        <w:keepNext/>
-      </w:pPr>
-      <w:r>
-        <w:rPr>
-          <w:b w:val="0"/>
-        </w:rPr>
-      </w:r>
-      <w:r>
-        <w:rPr>
-          <w:b/>
-        </w:rPr>
-        <w:t>Adjunct Faculty Member | 2020 - Present</w:t>
-      </w:r>
-      <w:r>
-        <w:rPr>
-          <w:b w:val="0"/>
-        </w:rPr>
-      </w:r>
-    </w:p>
-    <w:p>
-      <w:pPr/>
-      <w:r>
-        <w:rPr>
-          <w:b w:val="0"/>
-        </w:rPr>
-        <w:t>Department of Applied Statistics, Faculty of Applied Science.</w:t>
-      </w:r>
-    </w:p>
-    <w:p>
-      <w:pPr>
-        <w:pStyle w:val="ListBullet"/>
-      </w:pPr>
-      <w:r>
-        <w:rPr>
-          <w:b w:val="0"/>
-        </w:rPr>
-        <w:t>Teach 040563107, Tools for Statistical Data Science, and 040563105, Statistical Analysis for Big Data.</w:t>
-      </w:r>
-    </w:p>
-    <w:p>
-      <w:pPr>
-        <w:pStyle w:val="Heading2"/>
-      </w:pPr>
-      <w:r>
-        <w:t>Thai-Nichi Institute of Technology</w:t>
-      </w:r>
-    </w:p>
-    <w:p>
-      <w:pPr>
-        <w:keepNext/>
-      </w:pPr>
-      <w:r>
-        <w:rPr>
-          <w:b w:val="0"/>
-        </w:rPr>
-      </w:r>
-      <w:r>
-        <w:rPr>
-          <w:b/>
-        </w:rPr>
-        <w:t>Adjunct Faculty Member | Semester 1/2020</w:t>
-      </w:r>
-      <w:r>
-        <w:rPr>
-          <w:b w:val="0"/>
-        </w:rPr>
-      </w:r>
-    </w:p>
-    <w:p>
-      <w:pPr/>
-      <w:r>
-        <w:rPr>
-          <w:b w:val="0"/>
-        </w:rPr>
-        <w:t>Digital Engineering, International Program.</w:t>
-      </w:r>
-    </w:p>
-    <w:p>
-      <w:pPr>
-        <w:pStyle w:val="ListBullet"/>
-      </w:pPr>
-      <w:r>
-        <w:rPr>
-          <w:b w:val="0"/>
-        </w:rPr>
-        <w:t>Taught DGE-306, Big Data Engineering.</w:t>
-      </w:r>
-    </w:p>
-    <w:p>
-      <w:pPr>
-        <w:pStyle w:val="Heading2"/>
-      </w:pPr>
-      <w:r>
-        <w:t>Prince of Songkla University Phuket Campus</w:t>
-      </w:r>
-    </w:p>
-    <w:p>
-      <w:pPr>
-        <w:keepNext/>
-      </w:pPr>
-      <w:r>
-        <w:rPr>
-          <w:b w:val="0"/>
-        </w:rPr>
-      </w:r>
-      <w:r>
-        <w:rPr>
-          <w:b/>
-        </w:rPr>
-        <w:t>Adjunct Faculty Member | Semester 1/2017</w:t>
-      </w:r>
-      <w:r>
-        <w:rPr>
-          <w:b w:val="0"/>
-        </w:rPr>
-      </w:r>
-    </w:p>
-    <w:p>
-      <w:pPr>
-        <w:pStyle w:val="ListBullet"/>
-      </w:pPr>
-      <w:r>
-        <w:rPr>
-          <w:b w:val="0"/>
-        </w:rPr>
-        <w:t>Taught EB976-302, E-Payment.</w:t>
-      </w:r>
-    </w:p>
-    <w:p>
-      <w:pPr>
-        <w:pStyle w:val="Heading1"/>
-      </w:pPr>
-      <w:r>
-        <w:t>Selected Guest Speaking</w:t>
-      </w:r>
-    </w:p>
-    <w:p>
-      <w:pPr/>
-      <w:r>
-        <w:rPr>
-          <w:b w:val="0"/>
-        </w:rPr>
-        <w:t>Guest-speaking engagements at KMITL, NIDA, and True Digital Academy.</w:t>
-      </w:r>
-    </w:p>
-    <w:p>
-      <w:pPr>
-        <w:pStyle w:val="Heading1"/>
-        <w:pageBreakBefore/>
-      </w:pPr>
-      <w:r>
-        <w:t>Academic Leadership and Earlier Experience</w:t>
-      </w:r>
-    </w:p>
-    <w:p>
-      <w:pPr>
-        <w:pStyle w:val="Heading2"/>
-      </w:pPr>
-      <w:r>
-        <w:t>Assumption University</w:t>
-      </w:r>
-    </w:p>
-    <w:p>
-      <w:pPr>
-        <w:keepNext/>
-      </w:pPr>
-      <w:r>
-        <w:rPr>
-          <w:b w:val="0"/>
-        </w:rPr>
-      </w:r>
-      <w:r>
-        <w:rPr>
-          <w:b/>
-        </w:rPr>
-        <w:t>Vincent Mary School of Engineering | Lecturer, Computer Engineering | June 2006 - April 2018</w:t>
-      </w:r>
-      <w:r>
-        <w:rPr>
-          <w:b w:val="0"/>
-        </w:rPr>
-      </w:r>
-    </w:p>
-    <w:p>
-      <w:pPr>
-        <w:keepNext/>
-      </w:pPr>
-      <w:r>
-        <w:rPr>
-          <w:b w:val="0"/>
-        </w:rPr>
-      </w:r>
-      <w:r>
-        <w:rPr>
-          <w:b/>
-        </w:rPr>
-        <w:t>Chairperson, Computer Engineering | October 2016 - April 2018</w:t>
-      </w:r>
-      <w:r>
-        <w:rPr>
-          <w:b w:val="0"/>
-        </w:rPr>
-      </w:r>
-    </w:p>
-    <w:p>
-      <w:pPr>
-        <w:keepNext/>
-      </w:pPr>
-      <w:r>
-        <w:rPr>
-          <w:b w:val="0"/>
-        </w:rPr>
-      </w:r>
-      <w:r>
-        <w:rPr>
-          <w:b/>
-        </w:rPr>
-        <w:t>Acting Chairperson, Aeronautic Engineering | February 2016 - September 2016</w:t>
-      </w:r>
-      <w:r>
-        <w:rPr>
-          <w:b w:val="0"/>
-        </w:rPr>
-      </w:r>
-    </w:p>
-    <w:p>
-      <w:pPr>
-        <w:pStyle w:val="ListBullet"/>
-      </w:pPr>
-      <w:r>
-        <w:rPr>
-          <w:b w:val="0"/>
-        </w:rPr>
-        <w:t>Taught algorithm design, programming, digital logic, embedded systems, microprocessor and interfacing laboratories, discrete mathematics, and cloud computing.</w:t>
-      </w:r>
-    </w:p>
-    <w:p>
-      <w:pPr>
-        <w:pStyle w:val="ListBullet"/>
-      </w:pPr>
-      <w:r>
-        <w:rPr>
-          <w:b w:val="0"/>
-        </w:rPr>
-        <w:t>Served on the School of Engineering Quality Assurance Team, May 2013 - April 2018, and as Responsible Faculty Member for Computer Engineering, August 2017 - April 2018, and Aeronautic Engineering, February 2015 - July 2017.</w:t>
-      </w:r>
-    </w:p>
-    <w:p>
-      <w:pPr>
-        <w:pStyle w:val="ListBullet"/>
-      </w:pPr>
-      <w:r>
-        <w:rPr>
-          <w:b w:val="0"/>
-        </w:rPr>
-        <w:t>Held academic-advising, student-development, and international-relations coordination appointments.</w:t>
-      </w:r>
-    </w:p>
-    <w:p>
-      <w:pPr>
-        <w:keepNext/>
-      </w:pPr>
-      <w:r>
-        <w:rPr>
-          <w:b w:val="0"/>
-        </w:rPr>
-      </w:r>
-      <w:r>
-        <w:rPr>
-          <w:b/>
-        </w:rPr>
-        <w:t>Selected Applied Research Projects | May 2013 - April 2018</w:t>
-      </w:r>
-      <w:r>
-        <w:rPr>
-          <w:b w:val="0"/>
-        </w:rPr>
-      </w:r>
-    </w:p>
-    <w:p>
-      <w:pPr>
-        <w:pStyle w:val="ListBullet"/>
-      </w:pPr>
-      <w:r>
-        <w:rPr>
-          <w:b w:val="0"/>
-        </w:rPr>
-      </w:r>
-      <w:r>
-        <w:rPr>
-          <w:b/>
-        </w:rPr>
-        <w:t>Open IoT platform and prototypes:</w:t>
-      </w:r>
-      <w:r>
-        <w:rPr>
-          <w:b w:val="0"/>
-        </w:rPr>
-        <w:t xml:space="preserve"> Developed an open platform using Raspberry Pi and prototypes for access control, voice-controlled communications, and customer counting.</w:t>
-      </w:r>
-    </w:p>
-    <w:p>
-      <w:pPr>
-        <w:pStyle w:val="ListBullet"/>
-      </w:pPr>
-      <w:r>
-        <w:rPr>
-          <w:b w:val="0"/>
-        </w:rPr>
-      </w:r>
-      <w:r>
-        <w:rPr>
-          <w:b/>
-        </w:rPr>
-        <w:t>Sensor analytics:</w:t>
-      </w:r>
-      <w:r>
-        <w:rPr>
-          <w:b w:val="0"/>
-        </w:rPr>
-        <w:t xml:space="preserve"> Conducted big-data analysis using temperature and power sensor data.</w:t>
-      </w:r>
-    </w:p>
-    <w:p>
-      <w:pPr>
-        <w:pStyle w:val="ListBullet"/>
-      </w:pPr>
-      <w:r>
-        <w:rPr>
-          <w:b w:val="0"/>
-        </w:rPr>
-      </w:r>
-      <w:r>
-        <w:rPr>
-          <w:b/>
-        </w:rPr>
-        <w:t>Cloud-based social media analytics:</w:t>
-      </w:r>
-      <w:r>
-        <w:rPr>
-          <w:b w:val="0"/>
-        </w:rPr>
-        <w:t xml:space="preserve"> Conducted Thai-language social trend analysis using Google Cloud Platform.</w:t>
-      </w:r>
-    </w:p>
-    <w:p>
-      <w:pPr>
-        <w:pStyle w:val="Heading2"/>
-      </w:pPr>
-      <w:r>
-        <w:t>Saijo Denki International Co Ltd</w:t>
-      </w:r>
-    </w:p>
-    <w:p>
-      <w:pPr>
-        <w:keepNext/>
-      </w:pPr>
-      <w:r>
-        <w:rPr>
-          <w:b w:val="0"/>
-        </w:rPr>
-      </w:r>
-      <w:r>
-        <w:rPr>
-          <w:b/>
-        </w:rPr>
-        <w:t>Technical Consultant and Co-PI | August 2014 - April 2018 | Bangkok, Thailand</w:t>
-      </w:r>
-      <w:r>
-        <w:rPr>
-          <w:b w:val="0"/>
-        </w:rPr>
-      </w:r>
-    </w:p>
-    <w:p>
-      <w:pPr>
-        <w:pStyle w:val="ListBullet"/>
-      </w:pPr>
-      <w:r>
-        <w:rPr>
-          <w:b w:val="0"/>
-        </w:rPr>
-        <w:t>Launched IoT-enabled consumer products, including split-system air conditioners and air purifiers.</w:t>
-      </w:r>
-    </w:p>
-    <w:p>
-      <w:pPr>
-        <w:pStyle w:val="ListBullet"/>
-      </w:pPr>
-      <w:r>
-        <w:rPr>
-          <w:b w:val="0"/>
-        </w:rPr>
-        <w:t>Researched IoT, mobile network applications, and online-to-offline services in an in-house startup.</w:t>
-      </w:r>
-    </w:p>
-    <w:p>
-      <w:pPr>
-        <w:pStyle w:val="Heading2"/>
-      </w:pPr>
-      <w:r>
-        <w:t>Florida International University</w:t>
-      </w:r>
-    </w:p>
-    <w:p>
-      <w:pPr>
-        <w:keepNext/>
-      </w:pPr>
-      <w:r>
-        <w:rPr>
-          <w:b w:val="0"/>
-        </w:rPr>
-      </w:r>
-      <w:r>
-        <w:rPr>
-          <w:b/>
-        </w:rPr>
-        <w:t>Researcher | August 2008 - April 2013 | Miami, Florida, United States</w:t>
-      </w:r>
-      <w:r>
-        <w:rPr>
-          <w:b w:val="0"/>
-        </w:rPr>
-      </w:r>
-    </w:p>
-    <w:p>
-      <w:pPr>
-        <w:keepNext/>
-      </w:pPr>
-      <w:r>
-        <w:rPr>
-          <w:b w:val="0"/>
-        </w:rPr>
-      </w:r>
-      <w:r>
-        <w:rPr>
-          <w:b/>
-        </w:rPr>
-        <w:t>Graduate Assistant, Electrical and Computer Engineering | September 2010 - April 2013</w:t>
-      </w:r>
-      <w:r>
-        <w:rPr>
-          <w:b w:val="0"/>
-        </w:rPr>
-      </w:r>
-    </w:p>
-    <w:p>
-      <w:pPr>
-        <w:keepNext/>
-      </w:pPr>
-      <w:r>
-        <w:rPr>
-          <w:b w:val="0"/>
-        </w:rPr>
-      </w:r>
-      <w:r>
-        <w:rPr>
-          <w:b/>
-        </w:rPr>
-        <w:t>Graduate Assistant, Telecommunications and Information Technology | August 2008 - August 2010</w:t>
-      </w:r>
-      <w:r>
-        <w:rPr>
-          <w:b w:val="0"/>
-        </w:rPr>
-      </w:r>
-    </w:p>
-    <w:p>
-      <w:pPr>
-        <w:pStyle w:val="ListBullet"/>
-      </w:pPr>
-      <w:r>
-        <w:rPr>
-          <w:b w:val="0"/>
-        </w:rPr>
-        <w:t>Conducted computer engineering and telecommunications research as a team lead and team member.</w:t>
-      </w:r>
-    </w:p>
-    <w:p>
-      <w:pPr>
-        <w:pStyle w:val="ListBullet"/>
-      </w:pPr>
-      <w:r>
-        <w:rPr>
-          <w:b w:val="0"/>
-        </w:rPr>
-        <w:t>Coordinated assessment surveys, comprehensive examinations, and portfolios for undergraduate engineering programs in ABET-related work with the Undergraduate Program Director.</w:t>
-      </w:r>
-    </w:p>
-    <w:p>
-      <w:pPr>
-        <w:pStyle w:val="ListBullet"/>
-      </w:pPr>
-      <w:r>
-        <w:rPr>
-          <w:b w:val="0"/>
-        </w:rPr>
-        <w:t>Contributed to undergraduate and graduate curriculum development and taught Electronic I and Integrated Circuits laboratories in 2011-2012.</w:t>
-      </w:r>
-    </w:p>
-    <w:p>
-      <w:pPr>
-        <w:pStyle w:val="Heading1"/>
-      </w:pPr>
-      <w:r>
-        <w:t>Earlier Appointments</w:t>
-      </w:r>
-    </w:p>
-    <w:p>
-      <w:pPr>
-        <w:pStyle w:val="ListBullet"/>
-      </w:pPr>
-      <w:r>
-        <w:rPr>
-          <w:b w:val="0"/>
-        </w:rPr>
-      </w:r>
-      <w:r>
-        <w:rPr>
-          <w:b/>
-        </w:rPr>
-        <w:t>Research Internship | HEIG-VD | December 2007 - March 2008.</w:t>
-      </w:r>
-      <w:r>
-        <w:rPr>
-          <w:b w:val="0"/>
-        </w:rPr>
-      </w:r>
-    </w:p>
-    <w:p>
-      <w:pPr>
-        <w:pStyle w:val="ListBullet"/>
-      </w:pPr>
-      <w:r>
-        <w:rPr>
-          <w:b w:val="0"/>
-        </w:rPr>
-      </w:r>
-      <w:r>
-        <w:rPr>
-          <w:b/>
-        </w:rPr>
-        <w:t>IT Consultant | Santonino Co., Ltd., Thailand | January 2003 - June 2008.</w:t>
-      </w:r>
-      <w:r>
-        <w:rPr>
-          <w:b w:val="0"/>
-        </w:rPr>
-      </w:r>
-    </w:p>
-    <w:p>
-      <w:pPr>
-        <w:pStyle w:val="ListBullet"/>
-      </w:pPr>
-      <w:r>
-        <w:rPr>
-          <w:b w:val="0"/>
-        </w:rPr>
-      </w:r>
-      <w:r>
-        <w:rPr>
-          <w:b/>
-        </w:rPr>
-        <w:t>Teaching Assistant | Assumption University | June 2003 - September 2005.</w:t>
-      </w:r>
-      <w:r>
-        <w:rPr>
-          <w:b w:val="0"/>
-        </w:rPr>
-      </w:r>
-    </w:p>
-    <w:p>
-      <w:pPr>
-        <w:pStyle w:val="Heading1"/>
-        <w:pageBreakBefore/>
-      </w:pPr>
-      <w:r>
-        <w:t>Education</w:t>
-      </w:r>
-    </w:p>
-    <w:p>
-      <w:pPr>
-        <w:keepNext/>
-      </w:pPr>
-      <w:r>
-        <w:rPr>
-          <w:b w:val="0"/>
-        </w:rPr>
-      </w:r>
-      <w:r>
-        <w:rPr>
-          <w:b/>
-        </w:rPr>
-        <w:t>Doctor of Philosophy in Electrical Engineering</w:t>
-      </w:r>
-      <w:r>
-        <w:rPr>
-          <w:b w:val="0"/>
-        </w:rPr>
-      </w:r>
-    </w:p>
-    <w:p>
-      <w:pPr/>
-      <w:r>
-        <w:rPr>
-          <w:b w:val="0"/>
-        </w:rPr>
-        <w:t>Florida International University, Miami, Florida, United States | April 2013</w:t>
-      </w:r>
-    </w:p>
-    <w:p>
-      <w:pPr/>
-      <w:r>
-        <w:rPr>
-          <w:b w:val="0"/>
-        </w:rPr>
-        <w:t>Specialization in Telecommunications and Networking. Dissertation: Lightweight Middleware for SDR Inter-components Communication. Supervisor: Jean H. Andrian. Full financial graduate assistantship.</w:t>
-      </w:r>
-    </w:p>
-    <w:p>
-      <w:pPr>
-        <w:keepNext/>
-      </w:pPr>
-      <w:r>
-        <w:rPr>
-          <w:b w:val="0"/>
-        </w:rPr>
-      </w:r>
-      <w:r>
-        <w:rPr>
-          <w:b/>
-        </w:rPr>
-        <w:t>Master of Science in Computer Engineering</w:t>
-      </w:r>
-      <w:r>
-        <w:rPr>
-          <w:b w:val="0"/>
-        </w:rPr>
-      </w:r>
-    </w:p>
-    <w:p>
-      <w:pPr/>
-      <w:r>
-        <w:rPr>
-          <w:b w:val="0"/>
-        </w:rPr>
-        <w:t>Florida International University, Miami, Florida, United States | 2012</w:t>
-      </w:r>
-    </w:p>
-    <w:p>
-      <w:pPr>
-        <w:keepNext/>
-      </w:pPr>
-      <w:r>
-        <w:rPr>
-          <w:b w:val="0"/>
-        </w:rPr>
-      </w:r>
-      <w:r>
-        <w:rPr>
-          <w:b/>
-        </w:rPr>
-        <w:t>Bachelor of Engineering in Computer Engineering</w:t>
-      </w:r>
-      <w:r>
-        <w:rPr>
-          <w:b w:val="0"/>
-        </w:rPr>
-      </w:r>
-    </w:p>
-    <w:p>
-      <w:pPr/>
-      <w:r>
-        <w:rPr>
-          <w:b w:val="0"/>
-        </w:rPr>
-        <w:t>Assumption University, Bangkok, Thailand | March 2006</w:t>
-      </w:r>
-    </w:p>
-    <w:p>
-      <w:pPr/>
-      <w:r>
-        <w:rPr>
-          <w:b w:val="0"/>
-        </w:rPr>
-        <w:t>Full scholarship from Assumption University.</w:t>
+        <w:t>Data and AI executive with experience building analytics organizations, leading multidisciplinary teams, and establishing data foundations across financial services and telecommunications. Successfully launched a Data and AI Platform with a lean team and served as Acting Director of Data for a virtual banking initiative. A founding member of DataX, built its analytics and products department and directed AI product development. At True Digital Group, led 30+ data scientists and the launch of four analytics products. Combines technical and organizational leadership with university teaching in data science and business analytics, and research on decentralized data strategies for virtual banking.</w:t>
       </w:r>
     </w:p>
     <w:p>
@@ -1535,7 +167,1154 @@
         <w:pStyle w:val="Heading1"/>
       </w:pPr>
       <w:r>
-        <w:t>Selected Technology Foundation</w:t>
+        <w:t>Professional Experience</w:t>
+      </w:r>
+    </w:p>
+    <w:p>
+      <w:pPr/>
+      <w:r>
+        <w:rPr>
+          <w:b w:val="0"/>
+        </w:rPr>
+        <w:t>Career break from corporate roles since August 2026; adjunct university teaching continues.</w:t>
+      </w:r>
+    </w:p>
+    <w:p>
+      <w:pPr>
+        <w:pStyle w:val="Heading2"/>
+      </w:pPr>
+      <w:r>
+        <w:t>Infinitas by Krungthai</w:t>
+      </w:r>
+    </w:p>
+    <w:p>
+      <w:pPr>
+        <w:keepNext/>
+      </w:pPr>
+      <w:r>
+        <w:rPr>
+          <w:b w:val="0"/>
+        </w:rPr>
+      </w:r>
+      <w:r>
+        <w:rPr>
+          <w:b/>
+        </w:rPr>
+        <w:t>Director of Data Innovation | December 2024 - July 2026 | Bangkok, Thailand</w:t>
+      </w:r>
+      <w:r>
+        <w:rPr>
+          <w:b w:val="0"/>
+        </w:rPr>
+      </w:r>
+    </w:p>
+    <w:p>
+      <w:pPr>
+        <w:pStyle w:val="ListBullet"/>
+      </w:pPr>
+      <w:r>
+        <w:rPr>
+          <w:b w:val="0"/>
+        </w:rPr>
+        <w:t>Successfully launched a Data and AI Platform for a new group company with a lean team.</w:t>
+      </w:r>
+    </w:p>
+    <w:p>
+      <w:pPr>
+        <w:pStyle w:val="ListBullet"/>
+      </w:pPr>
+      <w:r>
+        <w:rPr>
+          <w:b w:val="0"/>
+        </w:rPr>
+        <w:t>Served as Acting Director of Data for a virtual banking initiative, leading platform setup from inception across data engineering, data architecture, and data governance.</w:t>
+      </w:r>
+    </w:p>
+    <w:p>
+      <w:pPr>
+        <w:pStyle w:val="ListBullet"/>
+      </w:pPr>
+      <w:r>
+        <w:rPr>
+          <w:b w:val="0"/>
+        </w:rPr>
+        <w:t>Planned the transfer of data and AI platform practices to other group companies.</w:t>
+      </w:r>
+    </w:p>
+    <w:p>
+      <w:pPr>
+        <w:pStyle w:val="Heading2"/>
+      </w:pPr>
+      <w:r>
+        <w:t>SCB DataX</w:t>
+      </w:r>
+    </w:p>
+    <w:p>
+      <w:pPr>
+        <w:keepNext/>
+      </w:pPr>
+      <w:r>
+        <w:rPr>
+          <w:b w:val="0"/>
+        </w:rPr>
+      </w:r>
+      <w:r>
+        <w:rPr>
+          <w:b/>
+        </w:rPr>
+        <w:t>Head of Analytics and Products | November 2021 - November 2024 | Bangkok, Thailand</w:t>
+      </w:r>
+      <w:r>
+        <w:rPr>
+          <w:b w:val="0"/>
+        </w:rPr>
+      </w:r>
+    </w:p>
+    <w:p>
+      <w:pPr>
+        <w:pStyle w:val="ListBullet"/>
+      </w:pPr>
+      <w:r>
+        <w:rPr>
+          <w:b w:val="0"/>
+        </w:rPr>
+        <w:t>As a founding member of DataX, the analytics subsidiary of SCB X, built the analytics organization and product team from inception.</w:t>
+      </w:r>
+    </w:p>
+    <w:p>
+      <w:pPr>
+        <w:pStyle w:val="ListBullet"/>
+      </w:pPr>
+      <w:r>
+        <w:rPr>
+          <w:b w:val="0"/>
+        </w:rPr>
+        <w:t>Led AI scientists, data scientists, data analysts, BI engineers, machine learning engineers, and product owners across research, analytics, engineering, and product development.</w:t>
+      </w:r>
+    </w:p>
+    <w:p>
+      <w:pPr>
+        <w:pStyle w:val="ListBullet"/>
+      </w:pPr>
+      <w:r>
+        <w:rPr>
+          <w:b w:val="0"/>
+        </w:rPr>
+        <w:t>Directed AI and analytics product vision, roadmaps, research, proofs of concept, and delivery.</w:t>
+      </w:r>
+    </w:p>
+    <w:p>
+      <w:pPr>
+        <w:pStyle w:val="Heading1"/>
+        <w:pageBreakBefore/>
+      </w:pPr>
+      <w:r>
+        <w:t>Professional Experience Continued</w:t>
+      </w:r>
+    </w:p>
+    <w:p>
+      <w:pPr>
+        <w:pStyle w:val="Heading2"/>
+      </w:pPr>
+      <w:r>
+        <w:t>True Digital Group</w:t>
+      </w:r>
+    </w:p>
+    <w:p>
+      <w:pPr>
+        <w:keepNext/>
+      </w:pPr>
+      <w:r>
+        <w:rPr>
+          <w:b w:val="0"/>
+        </w:rPr>
+      </w:r>
+      <w:r>
+        <w:rPr>
+          <w:b/>
+        </w:rPr>
+        <w:t>Analytics Business | March 2018 - October 2021 | Bangkok, Thailand</w:t>
+      </w:r>
+      <w:r>
+        <w:rPr>
+          <w:b w:val="0"/>
+        </w:rPr>
+      </w:r>
+    </w:p>
+    <w:p>
+      <w:pPr/>
+      <w:r>
+        <w:rPr>
+          <w:b w:val="0"/>
+        </w:rPr>
+        <w:t>Head of Product, Analytics Product | May 2021 - October 2021</w:t>
+      </w:r>
+    </w:p>
+    <w:p>
+      <w:pPr/>
+      <w:r>
+        <w:rPr>
+          <w:b w:val="0"/>
+        </w:rPr>
+        <w:t>Head of Product Development, Analytics Product | June 2019 - April 2021</w:t>
+      </w:r>
+    </w:p>
+    <w:p>
+      <w:pPr/>
+      <w:r>
+        <w:rPr>
+          <w:b w:val="0"/>
+        </w:rPr>
+        <w:t>Acting Head of Product | October 2020 - April 2021</w:t>
+      </w:r>
+    </w:p>
+    <w:p>
+      <w:pPr/>
+      <w:r>
+        <w:rPr>
+          <w:b w:val="0"/>
+        </w:rPr>
+        <w:t>Head of Risk Management Product, Analytics Product | January 2019 - May 2019</w:t>
+      </w:r>
+    </w:p>
+    <w:p>
+      <w:pPr/>
+      <w:r>
+        <w:rPr>
+          <w:b w:val="0"/>
+        </w:rPr>
+        <w:t>Principal Data Scientist | March 2018 - October 2021 (concurrent with leadership roles)</w:t>
+      </w:r>
+    </w:p>
+    <w:p>
+      <w:pPr>
+        <w:keepNext/>
+      </w:pPr>
+      <w:r>
+        <w:rPr>
+          <w:b w:val="0"/>
+        </w:rPr>
+      </w:r>
+      <w:r>
+        <w:rPr>
+          <w:b/>
+        </w:rPr>
+        <w:t>Leadership and Delivery</w:t>
+      </w:r>
+      <w:r>
+        <w:rPr>
+          <w:b w:val="0"/>
+        </w:rPr>
+      </w:r>
+    </w:p>
+    <w:p>
+      <w:pPr>
+        <w:pStyle w:val="ListBullet"/>
+      </w:pPr>
+      <w:r>
+        <w:rPr>
+          <w:b w:val="0"/>
+        </w:rPr>
+        <w:t>As Head of Product, led product development, product owners, and UX/UI teams; directed product vision, roadmaps, research, and proofs of concept; partnered with the Analytics Platform team on software development and delivery.</w:t>
+      </w:r>
+    </w:p>
+    <w:p>
+      <w:pPr>
+        <w:pStyle w:val="ListBullet"/>
+      </w:pPr>
+      <w:r>
+        <w:rPr>
+          <w:b w:val="0"/>
+        </w:rPr>
+        <w:t>As Head of Product Development, led 30+ data scientists researching and developing analytics products within an in-house startup.</w:t>
+      </w:r>
+    </w:p>
+    <w:p>
+      <w:pPr>
+        <w:pStyle w:val="ListBullet"/>
+      </w:pPr>
+      <w:r>
+        <w:rPr>
+          <w:b w:val="0"/>
+        </w:rPr>
+        <w:t>As Head of Risk Management Product, led risk analytics development and technical operations for internal and external clients; managed data scientists, business analysts, developers, and financial experts.</w:t>
+      </w:r>
+    </w:p>
+    <w:p>
+      <w:pPr>
+        <w:pStyle w:val="ListBullet"/>
+      </w:pPr>
+      <w:r>
+        <w:rPr>
+          <w:b w:val="0"/>
+        </w:rPr>
+        <w:t>Provided hybrid credit capabilities and solutions across multiple CP Group businesses.</w:t>
+      </w:r>
+    </w:p>
+    <w:p>
+      <w:pPr>
+        <w:keepNext/>
+      </w:pPr>
+      <w:r>
+        <w:rPr>
+          <w:b w:val="0"/>
+        </w:rPr>
+      </w:r>
+      <w:r>
+        <w:rPr>
+          <w:b/>
+        </w:rPr>
+        <w:t>Products Built and Launched During This Tenure</w:t>
+      </w:r>
+      <w:r>
+        <w:rPr>
+          <w:b w:val="0"/>
+        </w:rPr>
+      </w:r>
+    </w:p>
+    <w:p>
+      <w:pPr>
+        <w:pStyle w:val="ListBullet"/>
+      </w:pPr>
+      <w:r>
+        <w:rPr>
+          <w:b w:val="0"/>
+        </w:rPr>
+      </w:r>
+      <w:r>
+        <w:rPr>
+          <w:b/>
+        </w:rPr>
+        <w:t>GeoPulse | Location Intelligence:</w:t>
+      </w:r>
+      <w:r>
+        <w:rPr>
+          <w:b w:val="0"/>
+        </w:rPr>
+        <w:t xml:space="preserve"> Multidimensional density heat maps with analytical insights presented as a visual analytics product.</w:t>
+      </w:r>
+    </w:p>
+    <w:p>
+      <w:pPr>
+        <w:pStyle w:val="ListBullet"/>
+      </w:pPr>
+      <w:r>
+        <w:rPr>
+          <w:b w:val="0"/>
+        </w:rPr>
+      </w:r>
+      <w:r>
+        <w:rPr>
+          <w:b/>
+        </w:rPr>
+        <w:t>DigiPulse | Competitive Digital Analytics:</w:t>
+      </w:r>
+      <w:r>
+        <w:rPr>
+          <w:b w:val="0"/>
+        </w:rPr>
+        <w:t xml:space="preserve"> Digital footprint reports comparing competing businesses and their digital activity.</w:t>
+      </w:r>
+    </w:p>
+    <w:p>
+      <w:pPr>
+        <w:pStyle w:val="ListBullet"/>
+      </w:pPr>
+      <w:r>
+        <w:rPr>
+          <w:b w:val="0"/>
+        </w:rPr>
+      </w:r>
+      <w:r>
+        <w:rPr>
+          <w:b/>
+        </w:rPr>
+        <w:t>Customer360 for True Group | Behavioral Analytics:</w:t>
+      </w:r>
+      <w:r>
+        <w:rPr>
+          <w:b w:val="0"/>
+        </w:rPr>
+        <w:t xml:space="preserve"> Automated behavior extraction engines over a big-data platform for True Group.</w:t>
+      </w:r>
+    </w:p>
+    <w:p>
+      <w:pPr>
+        <w:pStyle w:val="ListBullet"/>
+      </w:pPr>
+      <w:r>
+        <w:rPr>
+          <w:b w:val="0"/>
+        </w:rPr>
+      </w:r>
+      <w:r>
+        <w:rPr>
+          <w:b/>
+        </w:rPr>
+        <w:t>True Score | Alternative Credit Scoring:</w:t>
+      </w:r>
+      <w:r>
+        <w:rPr>
+          <w:b w:val="0"/>
+        </w:rPr>
+        <w:t xml:space="preserve"> Alternative credit scoring as a service.</w:t>
+      </w:r>
+    </w:p>
+    <w:p>
+      <w:pPr>
+        <w:pStyle w:val="Heading2"/>
+      </w:pPr>
+      <w:r>
+        <w:t>Saijo Denki International Co., Ltd.</w:t>
+      </w:r>
+    </w:p>
+    <w:p>
+      <w:pPr>
+        <w:keepNext/>
+      </w:pPr>
+      <w:r>
+        <w:rPr>
+          <w:b w:val="0"/>
+        </w:rPr>
+      </w:r>
+      <w:r>
+        <w:rPr>
+          <w:b/>
+        </w:rPr>
+        <w:t>Technical Consultant and Co-PI | August 2014 - April 2018 | Bangkok, Thailand</w:t>
+      </w:r>
+      <w:r>
+        <w:rPr>
+          <w:b w:val="0"/>
+        </w:rPr>
+      </w:r>
+    </w:p>
+    <w:p>
+      <w:pPr>
+        <w:pStyle w:val="ListBullet"/>
+      </w:pPr>
+      <w:r>
+        <w:rPr>
+          <w:b w:val="0"/>
+        </w:rPr>
+        <w:t>Launched IoT-enabled consumer products, including split-system air conditioners and air purifiers.</w:t>
+      </w:r>
+    </w:p>
+    <w:p>
+      <w:pPr>
+        <w:pStyle w:val="ListBullet"/>
+      </w:pPr>
+      <w:r>
+        <w:rPr>
+          <w:b w:val="0"/>
+        </w:rPr>
+        <w:t>Researched IoT, mobile network applications, and online-to-offline services in an in-house startup.</w:t>
+      </w:r>
+    </w:p>
+    <w:p>
+      <w:pPr>
+        <w:pStyle w:val="Heading2"/>
+      </w:pPr>
+      <w:r>
+        <w:t>Santonino Co., Ltd.</w:t>
+      </w:r>
+    </w:p>
+    <w:p>
+      <w:pPr>
+        <w:keepNext/>
+      </w:pPr>
+      <w:r>
+        <w:rPr>
+          <w:b w:val="0"/>
+        </w:rPr>
+      </w:r>
+      <w:r>
+        <w:rPr>
+          <w:b/>
+        </w:rPr>
+        <w:t>IT Consultant | January 2003 - June 2008 | Thailand</w:t>
+      </w:r>
+      <w:r>
+        <w:rPr>
+          <w:b w:val="0"/>
+        </w:rPr>
+      </w:r>
+    </w:p>
+    <w:p>
+      <w:pPr>
+        <w:pStyle w:val="Heading1"/>
+        <w:pageBreakBefore/>
+      </w:pPr>
+      <w:r>
+        <w:t>Academic Leadership and Research</w:t>
+      </w:r>
+    </w:p>
+    <w:p>
+      <w:pPr>
+        <w:pStyle w:val="Heading2"/>
+      </w:pPr>
+      <w:r>
+        <w:t>Assumption University</w:t>
+      </w:r>
+    </w:p>
+    <w:p>
+      <w:pPr>
+        <w:keepNext/>
+      </w:pPr>
+      <w:r>
+        <w:rPr>
+          <w:b w:val="0"/>
+        </w:rPr>
+      </w:r>
+      <w:r>
+        <w:rPr>
+          <w:b/>
+        </w:rPr>
+        <w:t>Lecturer, Computer Engineering | June 2006 - April 2018</w:t>
+      </w:r>
+      <w:r>
+        <w:rPr>
+          <w:b w:val="0"/>
+        </w:rPr>
+      </w:r>
+    </w:p>
+    <w:p>
+      <w:pPr/>
+      <w:r>
+        <w:rPr>
+          <w:b w:val="0"/>
+        </w:rPr>
+        <w:t>Vincent Mary School of Engineering</w:t>
+      </w:r>
+    </w:p>
+    <w:p>
+      <w:pPr/>
+      <w:r>
+        <w:rPr>
+          <w:b w:val="0"/>
+        </w:rPr>
+        <w:t>Chairperson, Computer Engineering | October 2016 - April 2018</w:t>
+      </w:r>
+    </w:p>
+    <w:p>
+      <w:pPr/>
+      <w:r>
+        <w:rPr>
+          <w:b w:val="0"/>
+        </w:rPr>
+        <w:t>Acting Chairperson, Aeronautic Engineering | February 2016 - September 2016</w:t>
+      </w:r>
+    </w:p>
+    <w:p>
+      <w:pPr>
+        <w:pStyle w:val="ListBullet"/>
+      </w:pPr>
+      <w:r>
+        <w:rPr>
+          <w:b w:val="0"/>
+        </w:rPr>
+        <w:t>Taught algorithm design, programming, digital logic, embedded systems, microprocessor and interfacing laboratories, discrete mathematics, and cloud computing.</w:t>
+      </w:r>
+    </w:p>
+    <w:p>
+      <w:pPr>
+        <w:pStyle w:val="ListBullet"/>
+      </w:pPr>
+      <w:r>
+        <w:rPr>
+          <w:b w:val="0"/>
+        </w:rPr>
+        <w:t>Served on the School of Engineering Quality Assurance Team, May 2013 - April 2018.</w:t>
+      </w:r>
+    </w:p>
+    <w:p>
+      <w:pPr>
+        <w:pStyle w:val="ListBullet"/>
+      </w:pPr>
+      <w:r>
+        <w:rPr>
+          <w:b w:val="0"/>
+        </w:rPr>
+        <w:t>Served as Responsible Faculty Member for Computer Engineering, August 2017 - April 2018, and Aeronautic Engineering, February 2015 - July 2017.</w:t>
+      </w:r>
+    </w:p>
+    <w:p>
+      <w:pPr>
+        <w:pStyle w:val="ListBullet"/>
+      </w:pPr>
+      <w:r>
+        <w:rPr>
+          <w:b w:val="0"/>
+        </w:rPr>
+        <w:t>Held academic-advising, student-development, and international-relations coordination appointments.</w:t>
+      </w:r>
+    </w:p>
+    <w:p>
+      <w:pPr>
+        <w:keepNext/>
+      </w:pPr>
+      <w:r>
+        <w:rPr>
+          <w:b w:val="0"/>
+        </w:rPr>
+      </w:r>
+      <w:r>
+        <w:rPr>
+          <w:b/>
+        </w:rPr>
+        <w:t>Selected Applied Research | May 2013 - April 2018</w:t>
+      </w:r>
+      <w:r>
+        <w:rPr>
+          <w:b w:val="0"/>
+        </w:rPr>
+      </w:r>
+    </w:p>
+    <w:p>
+      <w:pPr>
+        <w:pStyle w:val="ListBullet"/>
+      </w:pPr>
+      <w:r>
+        <w:rPr>
+          <w:b w:val="0"/>
+        </w:rPr>
+      </w:r>
+      <w:r>
+        <w:rPr>
+          <w:b/>
+        </w:rPr>
+        <w:t>Open IoT platform:</w:t>
+      </w:r>
+      <w:r>
+        <w:rPr>
+          <w:b w:val="0"/>
+        </w:rPr>
+        <w:t xml:space="preserve"> Developed a Raspberry Pi platform and prototypes for access control, voice-controlled communications, and customer counting.</w:t>
+      </w:r>
+    </w:p>
+    <w:p>
+      <w:pPr>
+        <w:pStyle w:val="ListBullet"/>
+      </w:pPr>
+      <w:r>
+        <w:rPr>
+          <w:b w:val="0"/>
+        </w:rPr>
+      </w:r>
+      <w:r>
+        <w:rPr>
+          <w:b/>
+        </w:rPr>
+        <w:t>Sensor analytics:</w:t>
+      </w:r>
+      <w:r>
+        <w:rPr>
+          <w:b w:val="0"/>
+        </w:rPr>
+        <w:t xml:space="preserve"> Conducted big-data analysis using temperature and power sensor data.</w:t>
+      </w:r>
+    </w:p>
+    <w:p>
+      <w:pPr>
+        <w:pStyle w:val="ListBullet"/>
+      </w:pPr>
+      <w:r>
+        <w:rPr>
+          <w:b w:val="0"/>
+        </w:rPr>
+      </w:r>
+      <w:r>
+        <w:rPr>
+          <w:b/>
+        </w:rPr>
+        <w:t>Social media analytics:</w:t>
+      </w:r>
+      <w:r>
+        <w:rPr>
+          <w:b w:val="0"/>
+        </w:rPr>
+        <w:t xml:space="preserve"> Conducted Thai-language social trend analysis using Google Cloud Platform.</w:t>
+      </w:r>
+    </w:p>
+    <w:p>
+      <w:pPr>
+        <w:pStyle w:val="Heading2"/>
+      </w:pPr>
+      <w:r>
+        <w:t>Florida International University</w:t>
+      </w:r>
+    </w:p>
+    <w:p>
+      <w:pPr>
+        <w:keepNext/>
+      </w:pPr>
+      <w:r>
+        <w:rPr>
+          <w:b w:val="0"/>
+        </w:rPr>
+      </w:r>
+      <w:r>
+        <w:rPr>
+          <w:b/>
+        </w:rPr>
+        <w:t>Researcher | August 2008 - April 2013 | Miami, Florida, United States</w:t>
+      </w:r>
+      <w:r>
+        <w:rPr>
+          <w:b w:val="0"/>
+        </w:rPr>
+      </w:r>
+    </w:p>
+    <w:p>
+      <w:pPr/>
+      <w:r>
+        <w:rPr>
+          <w:b w:val="0"/>
+        </w:rPr>
+        <w:t>Graduate Assistant, Electrical and Computer Engineering | September 2010 - April 2013</w:t>
+      </w:r>
+    </w:p>
+    <w:p>
+      <w:pPr/>
+      <w:r>
+        <w:rPr>
+          <w:b w:val="0"/>
+        </w:rPr>
+        <w:t>Graduate Assistant, Telecommunications and Information Technology | August 2008 - August 2010</w:t>
+      </w:r>
+    </w:p>
+    <w:p>
+      <w:pPr>
+        <w:pStyle w:val="ListBullet"/>
+      </w:pPr>
+      <w:r>
+        <w:rPr>
+          <w:b w:val="0"/>
+        </w:rPr>
+        <w:t>Conducted computer engineering and telecommunications research as a team lead and team member.</w:t>
+      </w:r>
+    </w:p>
+    <w:p>
+      <w:pPr>
+        <w:pStyle w:val="ListBullet"/>
+      </w:pPr>
+      <w:r>
+        <w:rPr>
+          <w:b w:val="0"/>
+        </w:rPr>
+        <w:t>Coordinated ABET-related assessment surveys, comprehensive examinations, and undergraduate engineering portfolios with the Undergraduate Program Director.</w:t>
+      </w:r>
+    </w:p>
+    <w:p>
+      <w:pPr>
+        <w:pStyle w:val="ListBullet"/>
+      </w:pPr>
+      <w:r>
+        <w:rPr>
+          <w:b w:val="0"/>
+        </w:rPr>
+        <w:t>Contributed to undergraduate and graduate curriculum development; taught Electronic I and Integrated Circuits laboratories in 2011-2012.</w:t>
+      </w:r>
+    </w:p>
+    <w:p>
+      <w:pPr>
+        <w:pStyle w:val="Heading2"/>
+      </w:pPr>
+      <w:r>
+        <w:t>Earlier Academic Appointments</w:t>
+      </w:r>
+    </w:p>
+    <w:p>
+      <w:pPr>
+        <w:pStyle w:val="ListBullet"/>
+      </w:pPr>
+      <w:r>
+        <w:rPr>
+          <w:b w:val="0"/>
+        </w:rPr>
+      </w:r>
+      <w:r>
+        <w:rPr>
+          <w:b/>
+        </w:rPr>
+        <w:t>Research Internship | HEIG-VD | December 2007 - March 2008.</w:t>
+      </w:r>
+      <w:r>
+        <w:rPr>
+          <w:b w:val="0"/>
+        </w:rPr>
+      </w:r>
+    </w:p>
+    <w:p>
+      <w:pPr>
+        <w:pStyle w:val="ListBullet"/>
+      </w:pPr>
+      <w:r>
+        <w:rPr>
+          <w:b w:val="0"/>
+        </w:rPr>
+      </w:r>
+      <w:r>
+        <w:rPr>
+          <w:b/>
+        </w:rPr>
+        <w:t>Teaching Assistant | Assumption University | June 2003 - September 2005.</w:t>
+      </w:r>
+      <w:r>
+        <w:rPr>
+          <w:b w:val="0"/>
+        </w:rPr>
+      </w:r>
+    </w:p>
+    <w:p>
+      <w:pPr>
+        <w:pStyle w:val="Heading2"/>
+      </w:pPr>
+      <w:r>
+        <w:t>Academic Quality Assurance Experience</w:t>
+      </w:r>
+    </w:p>
+    <w:p>
+      <w:pPr/>
+      <w:r>
+        <w:rPr>
+          <w:b w:val="0"/>
+        </w:rPr>
+        <w:t>US ABET; Thailand TQF, TPQI, MUA, and ONESQA.</w:t>
+      </w:r>
+    </w:p>
+    <w:p>
+      <w:pPr>
+        <w:pStyle w:val="Heading1"/>
+        <w:pageBreakBefore/>
+      </w:pPr>
+      <w:r>
+        <w:t>Teaching and Professional Contribution</w:t>
+      </w:r>
+    </w:p>
+    <w:p>
+      <w:pPr>
+        <w:pStyle w:val="Heading2"/>
+      </w:pPr>
+      <w:r>
+        <w:t>Current Adjunct Appointments</w:t>
+      </w:r>
+    </w:p>
+    <w:p>
+      <w:pPr>
+        <w:keepNext/>
+      </w:pPr>
+      <w:r>
+        <w:rPr>
+          <w:b w:val="0"/>
+        </w:rPr>
+      </w:r>
+      <w:r>
+        <w:rPr>
+          <w:b/>
+        </w:rPr>
+        <w:t>Mahidol University</w:t>
+      </w:r>
+      <w:r>
+        <w:rPr>
+          <w:b w:val="0"/>
+        </w:rPr>
+      </w:r>
+    </w:p>
+    <w:p>
+      <w:pPr/>
+      <w:r>
+        <w:rPr>
+          <w:b w:val="0"/>
+        </w:rPr>
+        <w:t>Adjunct Faculty Member | September 2026 - Present | ICT program</w:t>
+      </w:r>
+    </w:p>
+    <w:p>
+      <w:pPr>
+        <w:keepNext/>
+      </w:pPr>
+      <w:r>
+        <w:rPr>
+          <w:b w:val="0"/>
+        </w:rPr>
+      </w:r>
+      <w:r>
+        <w:rPr>
+          <w:b/>
+        </w:rPr>
+        <w:t>Panyapiwat Institute of Management</w:t>
+      </w:r>
+      <w:r>
+        <w:rPr>
+          <w:b w:val="0"/>
+        </w:rPr>
+      </w:r>
+    </w:p>
+    <w:p>
+      <w:pPr/>
+      <w:r>
+        <w:rPr>
+          <w:b w:val="0"/>
+        </w:rPr>
+        <w:t>Adjunct Faculty Member | 2021 - Present</w:t>
+      </w:r>
+    </w:p>
+    <w:p>
+      <w:pPr>
+        <w:pStyle w:val="ListBullet"/>
+      </w:pPr>
+      <w:r>
+        <w:rPr>
+          <w:b w:val="0"/>
+        </w:rPr>
+        <w:t>Teach IB5172704, Data Analytics and Governance for Business Decision; previously IB62709, Big Data Analytics for Business Decision.</w:t>
+      </w:r>
+    </w:p>
+    <w:p>
+      <w:pPr>
+        <w:pStyle w:val="ListBullet"/>
+      </w:pPr>
+      <w:r>
+        <w:rPr>
+          <w:b w:val="0"/>
+        </w:rPr>
+        <w:t>Taught MI 62212, Big Data Analytics for Consumer Behavior, semester 1/2021; served as Responsible Faculty Member, 2019-2020.</w:t>
+      </w:r>
+    </w:p>
+    <w:p>
+      <w:pPr>
+        <w:keepNext/>
+      </w:pPr>
+      <w:r>
+        <w:rPr>
+          <w:b w:val="0"/>
+        </w:rPr>
+      </w:r>
+      <w:r>
+        <w:rPr>
+          <w:b/>
+        </w:rPr>
+        <w:t>King Mongkut's University of Technology North Bangkok</w:t>
+      </w:r>
+      <w:r>
+        <w:rPr>
+          <w:b w:val="0"/>
+        </w:rPr>
+      </w:r>
+    </w:p>
+    <w:p>
+      <w:pPr/>
+      <w:r>
+        <w:rPr>
+          <w:b w:val="0"/>
+        </w:rPr>
+        <w:t>Adjunct Faculty Member | 2020 - Present</w:t>
+      </w:r>
+    </w:p>
+    <w:p>
+      <w:pPr/>
+      <w:r>
+        <w:rPr>
+          <w:b w:val="0"/>
+        </w:rPr>
+        <w:t>Department of Applied Statistics, Faculty of Applied Science.</w:t>
+      </w:r>
+    </w:p>
+    <w:p>
+      <w:pPr>
+        <w:pStyle w:val="ListBullet"/>
+      </w:pPr>
+      <w:r>
+        <w:rPr>
+          <w:b w:val="0"/>
+        </w:rPr>
+        <w:t>Teach 040563107, Tools for Statistical Data Science, and 040563105, Statistical Analysis for Big Data.</w:t>
+      </w:r>
+    </w:p>
+    <w:p>
+      <w:pPr>
+        <w:pStyle w:val="Heading2"/>
+      </w:pPr>
+      <w:r>
+        <w:t>Previous Adjunct Appointments</w:t>
+      </w:r>
+    </w:p>
+    <w:p>
+      <w:pPr>
+        <w:pStyle w:val="ListBullet"/>
+      </w:pPr>
+      <w:r>
+        <w:rPr>
+          <w:b w:val="0"/>
+        </w:rPr>
+      </w:r>
+      <w:r>
+        <w:rPr>
+          <w:b/>
+        </w:rPr>
+        <w:t>Thai-Nichi Institute of Technology | Adjunct Faculty Member | Semester 1/2020:</w:t>
+      </w:r>
+      <w:r>
+        <w:rPr>
+          <w:b w:val="0"/>
+        </w:rPr>
+        <w:t xml:space="preserve"> Taught DGE-306, Big Data Engineering, Digital Engineering International Program.</w:t>
+      </w:r>
+    </w:p>
+    <w:p>
+      <w:pPr>
+        <w:pStyle w:val="ListBullet"/>
+      </w:pPr>
+      <w:r>
+        <w:rPr>
+          <w:b w:val="0"/>
+        </w:rPr>
+      </w:r>
+      <w:r>
+        <w:rPr>
+          <w:b/>
+        </w:rPr>
+        <w:t>Prince of Songkla University Phuket Campus | Adjunct Faculty Member | Semester 1/2017:</w:t>
+      </w:r>
+      <w:r>
+        <w:rPr>
+          <w:b w:val="0"/>
+        </w:rPr>
+        <w:t xml:space="preserve"> Taught EB976-302, E-Payment.</w:t>
+      </w:r>
+    </w:p>
+    <w:p>
+      <w:pPr>
+        <w:pStyle w:val="Heading2"/>
+      </w:pPr>
+      <w:r>
+        <w:t>Selected Guest Speaking</w:t>
+      </w:r>
+    </w:p>
+    <w:p>
+      <w:pPr/>
+      <w:r>
+        <w:rPr>
+          <w:b w:val="0"/>
+        </w:rPr>
+        <w:t>Guest-speaking engagements at KMITL, NIDA, and True Digital Academy.</w:t>
+      </w:r>
+    </w:p>
+    <w:p>
+      <w:pPr>
+        <w:pStyle w:val="Heading1"/>
+      </w:pPr>
+      <w:r>
+        <w:t>Education</w:t>
+      </w:r>
+    </w:p>
+    <w:p>
+      <w:pPr>
+        <w:keepNext/>
+      </w:pPr>
+      <w:r>
+        <w:rPr>
+          <w:b w:val="0"/>
+        </w:rPr>
+      </w:r>
+      <w:r>
+        <w:rPr>
+          <w:b/>
+        </w:rPr>
+        <w:t>Doctor of Philosophy in Electrical Engineering | April 2013</w:t>
+      </w:r>
+      <w:r>
+        <w:rPr>
+          <w:b w:val="0"/>
+        </w:rPr>
+      </w:r>
+    </w:p>
+    <w:p>
+      <w:pPr/>
+      <w:r>
+        <w:rPr>
+          <w:b w:val="0"/>
+        </w:rPr>
+        <w:t>Florida International University, Miami, Florida, United States</w:t>
+      </w:r>
+    </w:p>
+    <w:p>
+      <w:pPr/>
+      <w:r>
+        <w:rPr>
+          <w:b w:val="0"/>
+        </w:rPr>
+        <w:t>Specialization: Telecommunications and Networking. Dissertation: Lightweight Middleware for SDR Inter-components Communication. Supervisor: Jean H. Andrian. Full financial graduate assistantship.</w:t>
+      </w:r>
+    </w:p>
+    <w:p>
+      <w:pPr>
+        <w:keepNext/>
+      </w:pPr>
+      <w:r>
+        <w:rPr>
+          <w:b w:val="0"/>
+        </w:rPr>
+      </w:r>
+      <w:r>
+        <w:rPr>
+          <w:b/>
+        </w:rPr>
+        <w:t>Master of Science in Computer Engineering | 2012</w:t>
+      </w:r>
+      <w:r>
+        <w:rPr>
+          <w:b w:val="0"/>
+        </w:rPr>
+      </w:r>
+    </w:p>
+    <w:p>
+      <w:pPr/>
+      <w:r>
+        <w:rPr>
+          <w:b w:val="0"/>
+        </w:rPr>
+        <w:t>Florida International University, Miami, Florida, United States</w:t>
+      </w:r>
+    </w:p>
+    <w:p>
+      <w:pPr>
+        <w:keepNext/>
+      </w:pPr>
+      <w:r>
+        <w:rPr>
+          <w:b w:val="0"/>
+        </w:rPr>
+      </w:r>
+      <w:r>
+        <w:rPr>
+          <w:b/>
+        </w:rPr>
+        <w:t>Bachelor of Engineering in Computer Engineering | March 2006</w:t>
+      </w:r>
+      <w:r>
+        <w:rPr>
+          <w:b w:val="0"/>
+        </w:rPr>
+      </w:r>
+    </w:p>
+    <w:p>
+      <w:pPr/>
+      <w:r>
+        <w:rPr>
+          <w:b w:val="0"/>
+        </w:rPr>
+        <w:t>Assumption University, Bangkok, Thailand. Full scholarship from Assumption University.</w:t>
+      </w:r>
+    </w:p>
+    <w:p>
+      <w:pPr>
+        <w:pStyle w:val="Heading1"/>
+        <w:pageBreakBefore/>
+      </w:pPr>
+      <w:r>
+        <w:t>Technical Expertise</w:t>
       </w:r>
     </w:p>
     <w:p>
@@ -1631,24 +1410,6 @@
         <w:pStyle w:val="Heading1"/>
       </w:pPr>
       <w:r>
-        <w:t>Academic Quality Assurance Experience</w:t>
-      </w:r>
-    </w:p>
-    <w:p>
-      <w:pPr/>
-      <w:r>
-        <w:rPr>
-          <w:b w:val="0"/>
-        </w:rPr>
-        <w:t>US ABET; Thailand TQF, TPQI, MUA, and ONESQA.</w:t>
-      </w:r>
-    </w:p>
-    <w:p>
-      <w:pPr>
-        <w:pStyle w:val="Heading1"/>
-        <w:pageBreakBefore/>
-      </w:pPr>
-      <w:r>
         <w:t>Selected Publications</w:t>
       </w:r>
     </w:p>
@@ -1671,7 +1432,22 @@
         <w:rPr>
           <w:b w:val="0"/>
         </w:rPr>
-        <w:t xml:space="preserve"> W. A. Pongpech and P. Putthapipat. “Framework for Decentralized Data Strategies in Virtual Banking: Navigating Scalability, Innovation, and Regulatory Challenges in Thailand.” Proceedings of the 15th International Conference on Cloud Computing and Services Science (CLOSER), pp. 111-118. DOI: 10.5220/0013194500003950.</w:t>
+        <w:t xml:space="preserve"> W. A. Pongpech and P. Putthapipat. “Framework for Decentralized Data Strategies in Virtual Banking: Navigating Scalability, Innovation, and Regulatory Challenges in Thailand.” Proceedings of the 15th International Conference on Cloud Computing and Services Science (CLOSER), pp. 111-118. </w:t>
+      </w:r>
+      <w:hyperlink r:id="rId10">
+        <w:r>
+          <w:rPr>
+            <w:b w:val="0"/>
+            <w:u w:val="single"/>
+          </w:rPr>
+          <w:t>DOI: 10.5220/0013194500003950</w:t>
+        </w:r>
+      </w:hyperlink>
+      <w:r>
+        <w:rPr>
+          <w:b w:val="0"/>
+        </w:rPr>
+        <w:t>.</w:t>
       </w:r>
     </w:p>
     <w:p>
@@ -1781,7 +1557,22 @@
         <w:rPr>
           <w:b w:val="0"/>
         </w:rPr>
-        <w:t xml:space="preserve"> P. Putthapipat, J. H. Andrian, and C. Liu. “Studies on Inter-component Communication Latency based on Variation Number of Components and Packet size in SDR-SCA Waveform Application.” IJCSE, vol. 12, no. 1, pp. 65-72. DOI: 10.1504/IJCSE.2016.074564.</w:t>
+        <w:t xml:space="preserve"> P. Putthapipat, J. H. Andrian, and C. Liu. “Studies on Inter-component Communication Latency based on Variation Number of Components and Packet size in SDR-SCA Waveform Application.” IJCSE, vol. 12, no. 1, pp. 65-72. </w:t>
+      </w:r>
+      <w:hyperlink r:id="rId11">
+        <w:r>
+          <w:rPr>
+            <w:b w:val="0"/>
+            <w:u w:val="single"/>
+          </w:rPr>
+          <w:t>DOI: 10.1504/IJCSE.2016.074564</w:t>
+        </w:r>
+      </w:hyperlink>
+      <w:r>
+        <w:rPr>
+          <w:b w:val="0"/>
+        </w:rPr>
+        <w:t>.</w:t>
       </w:r>
     </w:p>
     <w:p>
@@ -1803,7 +1594,22 @@
         <w:rPr>
           <w:b w:val="0"/>
         </w:rPr>
-        <w:t xml:space="preserve"> P. Putthapipat and K. Techakittiroj. “PiFrame: A framework for home automation platform on the full feature OS.” International Conference on Electronics, Information, and Communications (ICEIC), pp. 1-4. DOI: 10.1109/ELINFOCOM.2016.7562978.</w:t>
+        <w:t xml:space="preserve"> P. Putthapipat and K. Techakittiroj. “PiFrame: A framework for home automation platform on the full feature OS.” International Conference on Electronics, Information, and Communications (ICEIC), pp. 1-4. </w:t>
+      </w:r>
+      <w:hyperlink r:id="rId12">
+        <w:r>
+          <w:rPr>
+            <w:b w:val="0"/>
+            <w:u w:val="single"/>
+          </w:rPr>
+          <w:t>DOI: 10.1109/ELINFOCOM.2016.7562978</w:t>
+        </w:r>
+      </w:hyperlink>
+      <w:r>
+        <w:rPr>
+          <w:b w:val="0"/>
+        </w:rPr>
+        <w:t>.</w:t>
       </w:r>
     </w:p>
     <w:p>
@@ -1825,7 +1631,22 @@
         <w:rPr>
           <w:b w:val="0"/>
         </w:rPr>
-        <w:t xml:space="preserve"> X. Jin, P. Putthapipat, D. Pan, N. Pissinou, and S. K. Makki. “Unpredictable Software-based Attestation Solution for node compromise detection in mobile WSN.” IEEE Globecom Workshops, pp. 2059-2064. DOI: 10.1109/GLOCOMW.2010.5700307.</w:t>
+        <w:t xml:space="preserve"> X. Jin, P. Putthapipat, D. Pan, N. Pissinou, and S. K. Makki. “Unpredictable Software-based Attestation Solution for node compromise detection in mobile WSN.” IEEE Globecom Workshops, pp. 2059-2064. </w:t>
+      </w:r>
+      <w:hyperlink r:id="rId13">
+        <w:r>
+          <w:rPr>
+            <w:b w:val="0"/>
+            <w:u w:val="single"/>
+          </w:rPr>
+          <w:t>DOI: 10.1109/GLOCOMW.2010.5700307</w:t>
+        </w:r>
+      </w:hyperlink>
+      <w:r>
+        <w:rPr>
+          <w:b w:val="0"/>
+        </w:rPr>
+        <w:t>.</w:t>
       </w:r>
     </w:p>
     <w:sectPr>

</xml_diff>